<commit_message>
docs: aktualizace lean canvas, nákladové struktury a upraveného plánu
Co-Authored-By: Claude Haiku 5.5 <noreply@anthropic.com>
</commit_message>
<xml_diff>
--- a/docs/vystupy/lean-canvas.docx
+++ b/docs/vystupy/lean-canvas.docx
@@ -345,7 +345,7 @@
               <w:rPr>
                 <w:rFonts w:ascii="Arial" w:hAnsi="Arial"/>
               </w:rPr>
-              <w:t>4.10.2026</w:t>
+              <w:t>9.10.2026</w:t>
             </w:r>
           </w:p>
         </w:tc>
@@ -390,7 +390,7 @@
                 <w:rFonts w:ascii="Arial" w:hAnsi="Arial"/>
                 <w:sz w:val="20"/>
               </w:rPr>
-              <w:t>1.1</w:t>
+              <w:t>1.2</w:t>
             </w:r>
           </w:p>
         </w:tc>
@@ -735,7 +735,7 @@
                 <w:color w:val="000000"/>
                 <w:sz w:val="19"/>
               </w:rPr>
-              <w:t>Mobilní aplikace spojující trenéra a majitele psa, kde má trenér možnost připravovat cvičení a sledovat jejich efektivitu i plnění v reálném čase.</w:t>
+              <w:t>Responzivní webová aplikace (optimalizovaná pro mobilní telefony) spojující trenéra a majitele psa, kde má trenér možnost připravovat cvičení a sledovat jejich efektivitu i plnění v reálném čase.</w:t>
             </w:r>
           </w:p>
         </w:tc>
@@ -867,7 +867,7 @@
                 <w:color w:val="000000"/>
                 <w:sz w:val="19"/>
               </w:rPr>
-              <w:t xml:space="preserve"> Psovodi, kteří trénují ve 2 a více disciplínách současně.</w:t>
+              <w:t xml:space="preserve"> Psovodi, kteří trénují jednoho či více psů ve 2 a více disciplínách současně.</w:t>
             </w:r>
           </w:p>
         </w:tc>
@@ -1424,7 +1424,7 @@
                 <w:color w:val="000000"/>
                 <w:sz w:val="19"/>
               </w:rPr>
-              <w:t>• Vývoj a údržba aplikace</w:t>
+              <w:t>• Vývoj a údržba webové aplikace</w:t>
             </w:r>
           </w:p>
           <w:p>
@@ -1438,7 +1438,7 @@
                 <w:color w:val="000000"/>
                 <w:sz w:val="19"/>
               </w:rPr>
-              <w:t>• Náklady na vývojářské účty (Apple Developer, Google Play)</w:t>
+              <w:t>• Doména a DNS</w:t>
             </w:r>
           </w:p>
         </w:tc>
@@ -1478,7 +1478,7 @@
                 <w:color w:val="000000"/>
                 <w:sz w:val="19"/>
               </w:rPr>
-              <w:t>• Např. 490 Kč / měsíc (do 15 aktivních psů)</w:t>
+              <w:t>• Solo trenér: 490 Kč / měsíc (do 15 aktivních psů)</w:t>
             </w:r>
           </w:p>
           <w:p>
@@ -1492,7 +1492,21 @@
                 <w:color w:val="000000"/>
                 <w:sz w:val="19"/>
               </w:rPr>
-              <w:t>• Pro psovody: 0 Kč (v rámci výcviku pod trenérem)</w:t>
+              <w:t>• Psí škola / Pro: 990 Kč / měsíc (neomezeně psů)</w:t>
+            </w:r>
+          </w:p>
+          <w:p>
+            <w:pPr>
+              <w:spacing w:before="0" w:after="40" w:line="252" w:lineRule="auto"/>
+            </w:pPr>
+            <w:r>
+              <w:rPr>
+                <w:rFonts w:ascii="Arial" w:hAnsi="Arial"/>
+                <w:b w:val="0"/>
+                <w:color w:val="000000"/>
+                <w:sz w:val="19"/>
+              </w:rPr>
+              <w:t>• Pro psovody: 0 Kč (včetně více psů v rámci výcviku pod trenérem)</w:t>
             </w:r>
           </w:p>
         </w:tc>

</xml_diff>

<commit_message>
docs: zapracování rozhovoru s trenérkou a FB1
- plán úprav (plan-uprav-po-fb1.md) se zjištěními z rozhovoru a rozhodnutími PO
- Lean Canvas 1.3 (.md i .docx): problém, alternativy, UVP, segmenty, metriky, náklady
- feature breakdown: stavy podle upraveného plánu a FB1, zdroj Rozhovor, nové F-44 až F-46, řádky seřazené podle epiců
- sitemapa (.md i .svg): pojmy cíl a záznam, přesun/přeskočení, záznam tréninku s vláknem, stav wireframů
- výsledky rozhovoru: doplněny H7, H8 a mezery
- otázky: zodpovězené z FB1 označeny, nové v otazky-fb2.md
</commit_message>
<xml_diff>
--- a/docs/vystupy/lean-canvas.docx
+++ b/docs/vystupy/lean-canvas.docx
@@ -180,14 +180,7 @@
                 <w:rFonts w:ascii="Arial" w:hAnsi="Arial"/>
                 <w:sz w:val="18"/>
               </w:rPr>
-              <w:t>Version</w:t>
-            </w:r>
-            <w:r>
-              <w:rPr>
-                <w:rFonts w:ascii="Arial" w:hAnsi="Arial"/>
-                <w:sz w:val="18"/>
-              </w:rPr>
-              <w:t>:</w:t>
+              <w:t>Version:</w:t>
             </w:r>
           </w:p>
         </w:tc>
@@ -217,15 +210,7 @@
                 <w:b/>
                 <w:sz w:val="36"/>
               </w:rPr>
-              <w:t>Lean</w:t>
-            </w:r>
-            <w:r>
-              <w:rPr>
-                <w:rFonts w:ascii="Arial" w:hAnsi="Arial"/>
-                <w:b/>
-                <w:sz w:val="36"/>
-              </w:rPr>
-              <w:t xml:space="preserve"> Canvas</w:t>
+              <w:t xml:space="preserve">Lean Canvas</w:t>
             </w:r>
           </w:p>
         </w:tc>
@@ -246,14 +231,12 @@
                 <w:rFonts w:ascii="Arial" w:hAnsi="Arial"/>
               </w:rPr>
             </w:pPr>
-            <w:proofErr w:type="spellStart"/>
             <w:r>
               <w:rPr>
                 <w:rFonts w:ascii="Arial" w:hAnsi="Arial"/>
               </w:rPr>
               <w:t>TrainLoop</w:t>
             </w:r>
-            <w:proofErr w:type="spellEnd"/>
           </w:p>
         </w:tc>
         <w:tc>
@@ -291,19 +274,11 @@
                 <w:rFonts w:ascii="Arial" w:hAnsi="Arial"/>
               </w:rPr>
             </w:pPr>
-            <w:proofErr w:type="spellStart"/>
-            <w:r>
-              <w:rPr>
-                <w:rFonts w:ascii="Arial" w:hAnsi="Arial"/>
-              </w:rPr>
-              <w:t>Tým</w:t>
-            </w:r>
-            <w:proofErr w:type="spellEnd"/>
-            <w:r>
-              <w:rPr>
-                <w:rFonts w:ascii="Arial" w:hAnsi="Arial"/>
-              </w:rPr>
-              <w:t xml:space="preserve"> 5 </w:t>
+            <w:r>
+              <w:rPr>
+                <w:rFonts w:ascii="Arial" w:hAnsi="Arial"/>
+              </w:rPr>
+              <w:t xml:space="preserve">Tým 5 </w:t>
             </w:r>
           </w:p>
         </w:tc>
@@ -390,7 +365,7 @@
                 <w:rFonts w:ascii="Arial" w:hAnsi="Arial"/>
                 <w:sz w:val="20"/>
               </w:rPr>
-              <w:t>1.2</w:t>
+              <w:t xml:space="preserve">1.3</w:t>
             </w:r>
           </w:p>
         </w:tc>
@@ -576,15 +551,7 @@
                 <w:b/>
                 <w:sz w:val="22"/>
               </w:rPr>
-              <w:t xml:space="preserve">Unique </w:t>
-            </w:r>
-            <w:r>
-              <w:rPr>
-                <w:rFonts w:ascii="Arial" w:hAnsi="Arial"/>
-                <w:b/>
-                <w:sz w:val="22"/>
-              </w:rPr>
-              <w:t>Value Proposition</w:t>
+              <w:t xml:space="preserve">Unique Value Proposition</w:t>
             </w:r>
           </w:p>
         </w:tc>
@@ -675,7 +642,7 @@
                 <w:color w:val="000000"/>
                 <w:sz w:val="18"/>
               </w:rPr>
-              <w:t>• Obtížná organizace cviků v tréninku psa napříč disciplínami</w:t>
+              <w:t xml:space="preserve">• Klienti si z ústního zadání na lekci zapamatují jen část a doma nevědí, jak postupovat, takže dělají zbytečné chyby</w:t>
             </w:r>
           </w:p>
           <w:p>
@@ -689,7 +656,7 @@
                 <w:color w:val="000000"/>
                 <w:sz w:val="18"/>
               </w:rPr>
-              <w:t>• Těžké srovnávání efektivity různých tréninků</w:t>
+              <w:t xml:space="preserve">• Zpětná vazba mezi lekcemi běží přes WhatsApp odtrženě od zadání a videa i odpovědi se klientovi ztrácejí v chatu</w:t>
             </w:r>
           </w:p>
           <w:p>
@@ -703,7 +670,7 @@
                 <w:color w:val="000000"/>
                 <w:sz w:val="18"/>
               </w:rPr>
-              <w:t>• Obtížná komunikace a ztráta kontextu mezi trenérem a majitelem psa mezi lekcemi</w:t>
+              <w:t xml:space="preserve">• Trenér opakovaně vysvětluje totéž („A jak bylo tohle?“)</w:t>
             </w:r>
           </w:p>
         </w:tc>
@@ -735,7 +702,7 @@
                 <w:color w:val="000000"/>
                 <w:sz w:val="19"/>
               </w:rPr>
-              <w:t>Responzivní webová aplikace (optimalizovaná pro mobilní telefony) spojující trenéra a majitele psa, kde má trenér možnost připravovat cvičení a sledovat jejich efektivitu i plnění v reálném čase.</w:t>
+              <w:t xml:space="preserve">Responzivní webová aplikace (optimalizovaná pro mobilní telefony / PWA) pro trenéra a jeho klienty. Trenér zadá plán: nejdřív princip a na co si dát pozor, pak cviky s instrukcí a kritériem zvládnutí. Klient ho má v týdenním kalendáři, trénink může přesunout nebo přeskočit a k odcvičenému tréninku pošle výsledek, poznámku a odkaz na video. Trenér odpoví ve vlákně u tréninku a rovnou upraví plán.</w:t>
             </w:r>
           </w:p>
         </w:tc>
@@ -761,7 +728,7 @@
                 <w:color w:val="000000"/>
                 <w:sz w:val="19"/>
               </w:rPr>
-              <w:t>Vidíte, co vaši klienti mezi lekcemi opravdu odcvičili, a plán jim upravíte hned.</w:t>
+              <w:t xml:space="preserve">Vaši klienti doma přesně vědí, co a jak cvičit, a vy nemusíte totéž vysvětlovat znovu.</w:t>
             </w:r>
           </w:p>
           <w:p>
@@ -775,7 +742,7 @@
                 <w:color w:val="000000"/>
                 <w:sz w:val="19"/>
               </w:rPr>
-              <w:t>Plán od trenéra, týden v kalendáři a video se zpětnou vazbou u každého úkolu. Celý výcvik psa na jednom místě.</w:t>
+              <w:t xml:space="preserve">Zadání z lekce v telefonu klienta, týden v kalendáři a dotaz s videem u konkrétního tréninku. Celý výcvik psa na jednom místě.</w:t>
             </w:r>
           </w:p>
         </w:tc>
@@ -835,7 +802,7 @@
                 <w:color w:val="000000"/>
                 <w:sz w:val="19"/>
               </w:rPr>
-              <w:t>Zákazník (platí):</w:t>
+              <w:t xml:space="preserve">Zákazník (platí):</w:t>
             </w:r>
             <w:r>
               <w:rPr>
@@ -844,7 +811,7 @@
                 <w:color w:val="000000"/>
                 <w:sz w:val="19"/>
               </w:rPr>
-              <w:t xml:space="preserve"> Nezávislí trenéři a trenérky, kteří vedou klienty i mezi lekcemi.</w:t>
+              <w:t xml:space="preserve"> Nezávislí trenéři, trenérky a psí školy, kteří vedou desítky klientů. Klienti chodí na lekci zhruba 1× měsíčně a mezi lekcemi trénují sami podle zadání.</w:t>
             </w:r>
           </w:p>
           <w:p>
@@ -858,7 +825,7 @@
                 <w:color w:val="000000"/>
                 <w:sz w:val="19"/>
               </w:rPr>
-              <w:t>Uživatel (zdarma):</w:t>
+              <w:t xml:space="preserve">Uživatel (zdarma):</w:t>
             </w:r>
             <w:r>
               <w:rPr>
@@ -867,7 +834,7 @@
                 <w:color w:val="000000"/>
                 <w:sz w:val="19"/>
               </w:rPr>
-              <w:t xml:space="preserve"> Psovodi, kteří trénují jednoho či více psů ve 2 a více disciplínách současně.</w:t>
+              <w:t xml:space="preserve"> Psovodi, kteří s jedním či více psy trénují pod vedením trenéra a dostávají úkoly na doma.</w:t>
             </w:r>
           </w:p>
         </w:tc>
@@ -927,15 +894,7 @@
                 <w:b/>
                 <w:sz w:val="22"/>
               </w:rPr>
-              <w:t xml:space="preserve">Key </w:t>
-            </w:r>
-            <w:r>
-              <w:rPr>
-                <w:rFonts w:ascii="Arial" w:hAnsi="Arial"/>
-                <w:b/>
-                <w:sz w:val="22"/>
-              </w:rPr>
-              <w:t>Metrics</w:t>
+              <w:t xml:space="preserve">Key Metrics</w:t>
             </w:r>
           </w:p>
         </w:tc>
@@ -1055,7 +1014,7 @@
                 <w:color w:val="000000"/>
                 <w:sz w:val="19"/>
               </w:rPr>
-              <w:t>• Tužka a papír</w:t>
+              <w:t xml:space="preserve">• Ústní zadání na lekci a vlastní poznámky klienta</w:t>
             </w:r>
           </w:p>
           <w:p>
@@ -1069,7 +1028,7 @@
                 <w:color w:val="000000"/>
                 <w:sz w:val="19"/>
               </w:rPr>
-              <w:t>• Excel</w:t>
+              <w:t xml:space="preserve">• WhatsApp (text a video) mezi lekcemi</w:t>
             </w:r>
           </w:p>
           <w:p>
@@ -1083,7 +1042,7 @@
                 <w:color w:val="000000"/>
                 <w:sz w:val="19"/>
               </w:rPr>
-              <w:t>• Strava</w:t>
+              <w:t xml:space="preserve">• Papírové deníky trenéra (zvlášť na psa a sport)</w:t>
             </w:r>
           </w:p>
           <w:p>
@@ -1097,7 +1056,7 @@
                 <w:color w:val="000000"/>
                 <w:sz w:val="19"/>
               </w:rPr>
-              <w:t>• Habit trackery</w:t>
+              <w:t xml:space="preserve">• Excel</w:t>
             </w:r>
           </w:p>
         </w:tc>
@@ -1201,7 +1160,7 @@
                 <w:color w:val="000000"/>
                 <w:sz w:val="18"/>
               </w:rPr>
-              <w:t>Retence psovodů:</w:t>
+              <w:t xml:space="preserve">Používání zadání:</w:t>
             </w:r>
             <w:r>
               <w:rPr>
@@ -1210,7 +1169,39 @@
                 <w:color w:val="000000"/>
                 <w:sz w:val="18"/>
               </w:rPr>
-              <w:t xml:space="preserve"> ≥ 60 % psovodů zapíše ≥ 2 tréninky týdně</w:t>
+              <w:t xml:space="preserve"> ≥ 50 % klientů otevře zadání mezi lekcemi alespoň 1× týdně</w:t>
+            </w:r>
+          </w:p>
+          <w:p>
+            <w:pPr>
+              <w:spacing w:before="0" w:after="40" w:line="252" w:lineRule="auto"/>
+            </w:pPr>
+            <w:r>
+              <w:rPr>
+                <w:rFonts w:ascii="Arial" w:hAnsi="Arial"/>
+                <w:b w:val="0"/>
+                <w:color w:val="000000"/>
+                <w:sz w:val="18"/>
+              </w:rPr>
+              <w:t xml:space="preserve">• </w:t>
+            </w:r>
+            <w:r>
+              <w:rPr>
+                <w:rFonts w:ascii="Arial" w:hAnsi="Arial"/>
+                <w:b/>
+                <w:color w:val="000000"/>
+                <w:sz w:val="18"/>
+              </w:rPr>
+              <w:t xml:space="preserve">Náhrada WhatsAppu:</w:t>
+            </w:r>
+            <w:r>
+              <w:rPr>
+                <w:rFonts w:ascii="Arial" w:hAnsi="Arial"/>
+                <w:b w:val="0"/>
+                <w:color w:val="000000"/>
+                <w:sz w:val="18"/>
+              </w:rPr>
+              <w:t xml:space="preserve"> ≥ 50 % dotazů a videí od klientů přichází přes TrainLoop (podle trenérů v pilotu)</w:t>
             </w:r>
           </w:p>
         </w:tc>
@@ -1318,7 +1309,7 @@
                 <w:color w:val="000000"/>
                 <w:sz w:val="18"/>
               </w:rPr>
-              <w:t>• Obecně nezávislí trenéři a trenérky s 5–20 klienty, kteří dnes dávají zpětnou vazbu např. přes WhatsApp.</w:t>
+              <w:t xml:space="preserve">• Nezávislí trenéři a trenérky, kteří dávají zadání ústně na lekci a mezi lekcemi odpovídají klientům přes WhatsApp.</w:t>
             </w:r>
           </w:p>
         </w:tc>
@@ -1438,7 +1429,35 @@
                 <w:color w:val="000000"/>
                 <w:sz w:val="19"/>
               </w:rPr>
+              <w:t xml:space="preserve">• Práce vývojového týmu (hodinová sazba × hodiny, výpočet po konzultaci s Honzou)</w:t>
+            </w:r>
+          </w:p>
+          <w:p>
+            <w:pPr>
+              <w:spacing w:before="0" w:after="40" w:line="252" w:lineRule="auto"/>
+            </w:pPr>
+            <w:r>
+              <w:rPr>
+                <w:rFonts w:ascii="Arial" w:hAnsi="Arial"/>
+                <w:b w:val="0"/>
+                <w:color w:val="000000"/>
+                <w:sz w:val="19"/>
+              </w:rPr>
               <w:t>• Doména a DNS</w:t>
+            </w:r>
+          </w:p>
+          <w:p>
+            <w:pPr>
+              <w:spacing w:before="0" w:after="40" w:line="252" w:lineRule="auto"/>
+            </w:pPr>
+            <w:r>
+              <w:rPr>
+                <w:rFonts w:ascii="Arial" w:hAnsi="Arial"/>
+                <w:b w:val="0"/>
+                <w:color w:val="000000"/>
+                <w:sz w:val="19"/>
+              </w:rPr>
+              <w:t xml:space="preserve">• Cíl: návratnost do cca 6 měsíců</w:t>
             </w:r>
           </w:p>
         </w:tc>
@@ -1552,21 +1571,7 @@
                 <w:rFonts w:ascii="Arial" w:hAnsi="Arial"/>
                 <w:sz w:val="16"/>
               </w:rPr>
-              <w:t xml:space="preserve">). </w:t>
-            </w:r>
-            <w:r>
-              <w:rPr>
-                <w:rFonts w:ascii="Arial" w:hAnsi="Arial"/>
-                <w:sz w:val="16"/>
-              </w:rPr>
-              <w:t>Word</w:t>
-            </w:r>
-            <w:r>
-              <w:rPr>
-                <w:rFonts w:ascii="Arial" w:hAnsi="Arial"/>
-                <w:sz w:val="16"/>
-              </w:rPr>
-              <w:t xml:space="preserve"> implementation by: Neos Chronos Limited (</w:t>
+              <w:t xml:space="preserve">). Word implementation by: Neos Chronos Limited (</w:t>
             </w:r>
             <w:hyperlink r:id="rId11" w:history="1">
               <w:r>

</xml_diff>

<commit_message>
docs: propsání zjištění z rozhovoru do Lean Canvasu, breakdownu a otázek na FB 2
- zjištění z rozhovoru s trenérkou a vyhodnocení hypotéz
- Lean Canvas 1.3 (md i docx): jádro je zadání z lekce v telefonu klienta
- varianta B Lean Canvasu (psovod začíná s deníkem) k diskusi s PO
- feature breakdown: změny priorit (sloupec J), nové F-44 až F-47, MVP podbarvené
- otázky na FB 2 včetně toho, co zatím nevíme

Co-Authored-By: Claude Opus 5.5 <noreply@anthropic.com>
</commit_message>
<xml_diff>
--- a/docs/vystupy/lean-canvas.docx
+++ b/docs/vystupy/lean-canvas.docx
@@ -390,7 +390,7 @@
                 <w:rFonts w:ascii="Arial" w:hAnsi="Arial"/>
                 <w:sz w:val="20"/>
               </w:rPr>
-              <w:t>1.2</w:t>
+              <w:t>1.3</w:t>
             </w:r>
           </w:p>
         </w:tc>
@@ -661,13 +661,7 @@
           <w:p>
             <w:pPr>
               <w:spacing w:before="0" w:after="40" w:line="252" w:lineRule="auto"/>
-              <w:rPr>
-                <w:rFonts w:ascii="Arial" w:hAnsi="Arial"/>
-                <w:color w:val="808080" w:themeColor="background1" w:themeShade="80"/>
-                <w:sz w:val="20"/>
-              </w:rPr>
-            </w:pPr>
-            <w:r/>
+            </w:pPr>
             <w:r>
               <w:rPr>
                 <w:rFonts w:ascii="Arial" w:hAnsi="Arial"/>
@@ -675,7 +669,7 @@
                 <w:color w:val="000000"/>
                 <w:sz w:val="18"/>
               </w:rPr>
-              <w:t>• Obtížná organizace cviků v tréninku psa napříč disciplínami</w:t>
+              <w:t xml:space="preserve">• Klienti si z ústního zadání zapíšou jen část a doma nevědí, co a jak cvičit (na lekci chodí cca 1× za měsíc).</w:t>
             </w:r>
           </w:p>
           <w:p>
@@ -689,7 +683,7 @@
                 <w:color w:val="000000"/>
                 <w:sz w:val="18"/>
               </w:rPr>
-              <w:t>• Těžké srovnávání efektivity různých tréninků</w:t>
+              <w:t xml:space="preserve">• Cvik se učí po dílčích krocích. Klient nepozná, na kterém kroku pes vázne.</w:t>
             </w:r>
           </w:p>
           <w:p>
@@ -703,7 +697,7 @@
                 <w:color w:val="000000"/>
                 <w:sz w:val="18"/>
               </w:rPr>
-              <w:t>• Obtížná komunikace a ztráta kontextu mezi trenérem a majitelem psa mezi lekcemi</w:t>
+              <w:t xml:space="preserve">• Dotaz přes WhatsApp nemá kontext úkolu, trenér se doptává na okolnosti.</w:t>
             </w:r>
           </w:p>
         </w:tc>
@@ -720,6 +714,113 @@
           <w:p>
             <w:pPr>
               <w:spacing w:before="0" w:after="40" w:line="252" w:lineRule="auto"/>
+            </w:pPr>
+            <w:r>
+              <w:rPr>
+                <w:rFonts w:ascii="Arial" w:hAnsi="Arial"/>
+                <w:b w:val="0"/>
+                <w:color w:val="000000"/>
+                <w:sz w:val="19"/>
+              </w:rPr>
+              <w:t xml:space="preserve">Responzivní webová aplikace (optimalizovaná pro mobil):</w:t>
+            </w:r>
+          </w:p>
+          <w:p>
+            <w:pPr>
+              <w:spacing w:before="0" w:after="40" w:line="252" w:lineRule="auto"/>
+            </w:pPr>
+            <w:r>
+              <w:rPr>
+                <w:rFonts w:ascii="Arial" w:hAnsi="Arial"/>
+                <w:b w:val="0"/>
+                <w:color w:val="000000"/>
+                <w:sz w:val="19"/>
+              </w:rPr>
+              <w:t xml:space="preserve">• Zadání z lekce v telefonu klienta: princip, dílčí kroky, kritérium zvládnutí a na co si dát pozor.</w:t>
+            </w:r>
+          </w:p>
+          <w:p>
+            <w:pPr>
+              <w:spacing w:before="0" w:after="40" w:line="252" w:lineRule="auto"/>
+            </w:pPr>
+            <w:r>
+              <w:rPr>
+                <w:rFonts w:ascii="Arial" w:hAnsi="Arial"/>
+                <w:b w:val="0"/>
+                <w:color w:val="000000"/>
+                <w:sz w:val="19"/>
+              </w:rPr>
+              <w:t xml:space="preserve">• Návrat o krok a vložení mezikroku, když pes opakuje stejnou chybu.</w:t>
+            </w:r>
+          </w:p>
+          <w:p>
+            <w:pPr>
+              <w:spacing w:before="0" w:after="40" w:line="252" w:lineRule="auto"/>
+            </w:pPr>
+            <w:r>
+              <w:rPr>
+                <w:rFonts w:ascii="Arial" w:hAnsi="Arial"/>
+                <w:b w:val="0"/>
+                <w:color w:val="000000"/>
+                <w:sz w:val="19"/>
+              </w:rPr>
+              <w:t xml:space="preserve">• Dotaz s videem přímo u úkolu, i s okolnostmi.</w:t>
+            </w:r>
+          </w:p>
+        </w:tc>
+        <w:tc>
+          <w:tcPr>
+            <w:tcW w:w="3227" w:type="dxa"/>
+            <w:gridSpan w:val="4"/>
+            <w:tcBorders>
+              <w:top w:val="nil"/>
+              <w:bottom w:val="nil"/>
+            </w:tcBorders>
+            <w:shd w:val="clear" w:color="auto" w:fill="FFFFFF" w:themeFill="background1"/>
+          </w:tcPr>
+          <w:p>
+            <w:pPr>
+              <w:spacing w:before="0" w:after="100" w:line="252" w:lineRule="auto"/>
+            </w:pPr>
+            <w:r>
+              <w:rPr>
+                <w:rFonts w:ascii="Arial" w:hAnsi="Arial"/>
+                <w:b/>
+                <w:color w:val="000000"/>
+                <w:sz w:val="19"/>
+              </w:rPr>
+              <w:t xml:space="preserve">Co trenér na lekci řekne, klient doma najde.</w:t>
+            </w:r>
+          </w:p>
+          <w:p>
+            <w:pPr>
+              <w:spacing w:before="0" w:after="40" w:line="252" w:lineRule="auto"/>
+            </w:pPr>
+            <w:r>
+              <w:rPr>
+                <w:rFonts w:ascii="Arial" w:hAnsi="Arial"/>
+                <w:b w:val="0"/>
+                <w:color w:val="000000"/>
+                <w:sz w:val="19"/>
+              </w:rPr>
+              <w:t xml:space="preserve">Zadání krok po kroku i s tím, na co si dát pozor. V telefonu, přímo na place. Méně doptávání „jak bylo tohle?“, víc vidět pokrok na další lekci.</w:t>
+            </w:r>
+          </w:p>
+        </w:tc>
+        <w:tc>
+          <w:tcPr>
+            <w:tcW w:w="3032" w:type="dxa"/>
+            <w:gridSpan w:val="2"/>
+            <w:tcBorders>
+              <w:top w:val="nil"/>
+              <w:bottom w:val="nil"/>
+            </w:tcBorders>
+            <w:shd w:val="clear" w:color="auto" w:fill="FFFFFF" w:themeFill="background1"/>
+          </w:tcPr>
+          <w:p>
+            <w:pPr>
+              <w:spacing w:before="0" w:after="40" w:line="252" w:lineRule="auto"/>
+              <w:ind w:right="-10"/>
               <w:rPr>
                 <w:rFonts w:ascii="Arial" w:hAnsi="Arial"/>
                 <w:color w:val="808080" w:themeColor="background1" w:themeShade="80"/>
@@ -735,14 +836,14 @@
                 <w:color w:val="000000"/>
                 <w:sz w:val="19"/>
               </w:rPr>
-              <w:t>Responzivní webová aplikace (optimalizovaná pro mobilní telefony) spojující trenéra a majitele psa, kde má trenér možnost připravovat cvičení a sledovat jejich efektivitu i plnění v reálném čase.</w:t>
-            </w:r>
-          </w:p>
-        </w:tc>
-        <w:tc>
-          <w:tcPr>
-            <w:tcW w:w="3227" w:type="dxa"/>
-            <w:gridSpan w:val="4"/>
+              <w:t>Neexistuje</w:t>
+            </w:r>
+          </w:p>
+        </w:tc>
+        <w:tc>
+          <w:tcPr>
+            <w:tcW w:w="3050" w:type="dxa"/>
+            <w:gridSpan w:val="3"/>
             <w:tcBorders>
               <w:top w:val="nil"/>
               <w:bottom w:val="nil"/>
@@ -753,7 +854,15 @@
             <w:pPr>
               <w:spacing w:before="0" w:after="100" w:line="252" w:lineRule="auto"/>
             </w:pPr>
-            <w:r/>
+            <w:r>
+              <w:rPr>
+                <w:rFonts w:ascii="Arial" w:hAnsi="Arial"/>
+                <w:b/>
+                <w:color w:val="000000"/>
+                <w:sz w:val="19"/>
+              </w:rPr>
+              <w:t xml:space="preserve">Zákazník (platí):</w:t>
+            </w:r>
             <w:r>
               <w:rPr>
                 <w:rFonts w:ascii="Arial" w:hAnsi="Arial"/>
@@ -761,7 +870,7 @@
                 <w:color w:val="000000"/>
                 <w:sz w:val="19"/>
               </w:rPr>
-              <w:t>Vidíte, co vaši klienti mezi lekcemi opravdu odcvičili, a plán jim upravíte hned.</w:t>
+              <w:t xml:space="preserve"> Nezávislí trenéři a trenérky, jejichž klienti trénují doma mezi lekcemi s delším odstupem (typicky 1× za měsíc).</w:t>
             </w:r>
           </w:p>
           <w:p>
@@ -771,103 +880,20 @@
             <w:r>
               <w:rPr>
                 <w:rFonts w:ascii="Arial" w:hAnsi="Arial"/>
+                <w:b/>
+                <w:color w:val="000000"/>
+                <w:sz w:val="19"/>
+              </w:rPr>
+              <w:t xml:space="preserve">Uživatel (zdarma):</w:t>
+            </w:r>
+            <w:r>
+              <w:rPr>
+                <w:rFonts w:ascii="Arial" w:hAnsi="Arial"/>
                 <w:b w:val="0"/>
                 <w:color w:val="000000"/>
                 <w:sz w:val="19"/>
               </w:rPr>
-              <w:t>Plán od trenéra, týden v kalendáři a video se zpětnou vazbou u každého úkolu. Celý výcvik psa na jednom místě.</w:t>
-            </w:r>
-          </w:p>
-        </w:tc>
-        <w:tc>
-          <w:tcPr>
-            <w:tcW w:w="3032" w:type="dxa"/>
-            <w:gridSpan w:val="2"/>
-            <w:tcBorders>
-              <w:top w:val="nil"/>
-              <w:bottom w:val="nil"/>
-            </w:tcBorders>
-            <w:shd w:val="clear" w:color="auto" w:fill="FFFFFF" w:themeFill="background1"/>
-          </w:tcPr>
-          <w:p>
-            <w:pPr>
-              <w:spacing w:before="0" w:after="40" w:line="252" w:lineRule="auto"/>
-              <w:ind w:right="-10"/>
-              <w:rPr>
-                <w:rFonts w:ascii="Arial" w:hAnsi="Arial"/>
-                <w:color w:val="808080" w:themeColor="background1" w:themeShade="80"/>
-                <w:sz w:val="20"/>
-                <w:lang w:val="it-IT"/>
-              </w:rPr>
-            </w:pPr>
-            <w:r/>
-            <w:r>
-              <w:rPr>
-                <w:rFonts w:ascii="Arial" w:hAnsi="Arial"/>
-                <w:b w:val="0"/>
-                <w:color w:val="000000"/>
-                <w:sz w:val="19"/>
-              </w:rPr>
-              <w:t>Neexistuje</w:t>
-            </w:r>
-          </w:p>
-        </w:tc>
-        <w:tc>
-          <w:tcPr>
-            <w:tcW w:w="3050" w:type="dxa"/>
-            <w:gridSpan w:val="3"/>
-            <w:tcBorders>
-              <w:top w:val="nil"/>
-              <w:bottom w:val="nil"/>
-            </w:tcBorders>
-            <w:shd w:val="clear" w:color="auto" w:fill="FFFFFF" w:themeFill="background1"/>
-          </w:tcPr>
-          <w:p>
-            <w:pPr>
-              <w:spacing w:before="0" w:after="100" w:line="252" w:lineRule="auto"/>
-              <w:ind w:right="-18"/>
-            </w:pPr>
-            <w:r/>
-            <w:r>
-              <w:rPr>
-                <w:rFonts w:ascii="Arial" w:hAnsi="Arial"/>
-                <w:b/>
-                <w:color w:val="000000"/>
-                <w:sz w:val="19"/>
-              </w:rPr>
-              <w:t>Zákazník (platí):</w:t>
-            </w:r>
-            <w:r>
-              <w:rPr>
-                <w:rFonts w:ascii="Arial" w:hAnsi="Arial"/>
-                <w:b w:val="0"/>
-                <w:color w:val="000000"/>
-                <w:sz w:val="19"/>
-              </w:rPr>
-              <w:t xml:space="preserve"> Nezávislí trenéři a trenérky, kteří vedou klienty i mezi lekcemi.</w:t>
-            </w:r>
-          </w:p>
-          <w:p>
-            <w:pPr>
-              <w:spacing w:before="0" w:after="40" w:line="252" w:lineRule="auto"/>
-            </w:pPr>
-            <w:r>
-              <w:rPr>
-                <w:rFonts w:ascii="Arial" w:hAnsi="Arial"/>
-                <w:b/>
-                <w:color w:val="000000"/>
-                <w:sz w:val="19"/>
-              </w:rPr>
-              <w:t>Uživatel (zdarma):</w:t>
-            </w:r>
-            <w:r>
-              <w:rPr>
-                <w:rFonts w:ascii="Arial" w:hAnsi="Arial"/>
-                <w:b w:val="0"/>
-                <w:color w:val="000000"/>
-                <w:sz w:val="19"/>
-              </w:rPr>
-              <w:t xml:space="preserve"> Psovodi, kteří trénují jednoho či více psů ve 2 a více disciplínách současně.</w:t>
+              <w:t xml:space="preserve"> Psovodi, kteří po lekci nebo semináři trénují sami a potřebují mít zadání u sebe.</w:t>
             </w:r>
           </w:p>
         </w:tc>
@@ -1041,13 +1067,7 @@
           <w:p>
             <w:pPr>
               <w:spacing w:before="0" w:after="40" w:line="252" w:lineRule="auto"/>
-              <w:rPr>
-                <w:rFonts w:ascii="Arial" w:hAnsi="Arial"/>
-                <w:color w:val="808080" w:themeColor="background1" w:themeShade="80"/>
-                <w:sz w:val="20"/>
-              </w:rPr>
-            </w:pPr>
-            <w:r/>
+            </w:pPr>
             <w:r>
               <w:rPr>
                 <w:rFonts w:ascii="Arial" w:hAnsi="Arial"/>
@@ -1055,7 +1075,7 @@
                 <w:color w:val="000000"/>
                 <w:sz w:val="19"/>
               </w:rPr>
-              <w:t>• Tužka a papír</w:t>
+              <w:t xml:space="preserve">• Ústní zadání a vlastní poznámky klienta</w:t>
             </w:r>
           </w:p>
           <w:p>
@@ -1069,7 +1089,7 @@
                 <w:color w:val="000000"/>
                 <w:sz w:val="19"/>
               </w:rPr>
-              <w:t>• Excel</w:t>
+              <w:t xml:space="preserve">• WhatsApp (text, video) mezi lekcemi</w:t>
             </w:r>
           </w:p>
           <w:p>
@@ -1083,7 +1103,7 @@
                 <w:color w:val="000000"/>
                 <w:sz w:val="19"/>
               </w:rPr>
-              <w:t>• Strava</w:t>
+              <w:t xml:space="preserve">• Papírový deník pro každého psa a sport</w:t>
             </w:r>
           </w:p>
           <w:p>
@@ -1097,7 +1117,7 @@
                 <w:color w:val="000000"/>
                 <w:sz w:val="19"/>
               </w:rPr>
-              <w:t>• Habit trackery</w:t>
+              <w:t xml:space="preserve">• Paměť trenéra</w:t>
             </w:r>
           </w:p>
         </w:tc>
@@ -1114,13 +1134,7 @@
           <w:p>
             <w:pPr>
               <w:spacing w:before="0" w:after="40" w:line="252" w:lineRule="auto"/>
-              <w:rPr>
-                <w:rFonts w:ascii="Arial" w:hAnsi="Arial"/>
-                <w:color w:val="808080" w:themeColor="background1" w:themeShade="80"/>
-                <w:sz w:val="20"/>
-              </w:rPr>
-            </w:pPr>
-            <w:r/>
+            </w:pPr>
             <w:r>
               <w:rPr>
                 <w:rFonts w:ascii="Arial" w:hAnsi="Arial"/>
@@ -1137,7 +1151,7 @@
                 <w:color w:val="000000"/>
                 <w:sz w:val="18"/>
               </w:rPr>
-              <w:t>10 platících trenérů</w:t>
+              <w:t xml:space="preserve">10 platících trenérů</w:t>
             </w:r>
             <w:r>
               <w:rPr>
@@ -1160,6 +1174,29 @@
                 <w:color w:val="000000"/>
                 <w:sz w:val="18"/>
               </w:rPr>
+              <w:t xml:space="preserve">• Trenér zapíše zadání po </w:t>
+            </w:r>
+            <w:r>
+              <w:rPr>
+                <w:rFonts w:ascii="Arial" w:hAnsi="Arial"/>
+                <w:b/>
+                <w:color w:val="000000"/>
+                <w:sz w:val="18"/>
+              </w:rPr>
+              <w:t xml:space="preserve">≥ 80 % lekcí</w:t>
+            </w:r>
+          </w:p>
+          <w:p>
+            <w:pPr>
+              <w:spacing w:before="0" w:after="40" w:line="252" w:lineRule="auto"/>
+            </w:pPr>
+            <w:r>
+              <w:rPr>
+                <w:rFonts w:ascii="Arial" w:hAnsi="Arial"/>
+                <w:b w:val="0"/>
+                <w:color w:val="000000"/>
+                <w:sz w:val="18"/>
+              </w:rPr>
               <w:t xml:space="preserve">• </w:t>
             </w:r>
             <w:r>
@@ -1169,7 +1206,7 @@
                 <w:color w:val="000000"/>
                 <w:sz w:val="18"/>
               </w:rPr>
-              <w:t>Minimálně 50 psů</w:t>
+              <w:t xml:space="preserve">≥ 60 % klientů</w:t>
             </w:r>
             <w:r>
               <w:rPr>
@@ -1178,39 +1215,7 @@
                 <w:color w:val="000000"/>
                 <w:sz w:val="18"/>
               </w:rPr>
-              <w:t xml:space="preserve"> aktivně vedených v aplikaci</w:t>
-            </w:r>
-          </w:p>
-          <w:p>
-            <w:pPr>
-              <w:spacing w:before="0" w:after="40" w:line="252" w:lineRule="auto"/>
-            </w:pPr>
-            <w:r>
-              <w:rPr>
-                <w:rFonts w:ascii="Arial" w:hAnsi="Arial"/>
-                <w:b w:val="0"/>
-                <w:color w:val="000000"/>
-                <w:sz w:val="18"/>
-              </w:rPr>
-              <w:t xml:space="preserve">• </w:t>
-            </w:r>
-            <w:r>
-              <w:rPr>
-                <w:rFonts w:ascii="Arial" w:hAnsi="Arial"/>
-                <w:b/>
-                <w:color w:val="000000"/>
-                <w:sz w:val="18"/>
-              </w:rPr>
-              <w:t>Retence psovodů:</w:t>
-            </w:r>
-            <w:r>
-              <w:rPr>
-                <w:rFonts w:ascii="Arial" w:hAnsi="Arial"/>
-                <w:b w:val="0"/>
-                <w:color w:val="000000"/>
-                <w:sz w:val="18"/>
-              </w:rPr>
-              <w:t xml:space="preserve"> ≥ 60 % psovodů zapíše ≥ 2 tréninky týdně</w:t>
+              <w:t xml:space="preserve"> otevře zadání mezi lekcemi alespoň 1× týdně</w:t>
             </w:r>
           </w:p>
         </w:tc>
@@ -1294,9 +1299,7 @@
           <w:p>
             <w:pPr>
               <w:spacing w:before="0" w:after="80" w:line="252" w:lineRule="auto"/>
-              <w:ind w:right="-10"/>
-            </w:pPr>
-            <w:r/>
+            </w:pPr>
             <w:r>
               <w:rPr>
                 <w:rFonts w:ascii="Arial" w:hAnsi="Arial"/>
@@ -1304,7 +1307,7 @@
                 <w:color w:val="000000"/>
                 <w:sz w:val="18"/>
               </w:rPr>
-              <w:t>• Lidé, se kterými už trénuje Veronika (PO): její trenéři a trenérky a jejich klienti.</w:t>
+              <w:t xml:space="preserve">• Lidé, se kterými už trénuje Veronika (PO): její trenéři a trenérky a jejich klienti.</w:t>
             </w:r>
           </w:p>
           <w:p>
@@ -1318,7 +1321,7 @@
                 <w:color w:val="000000"/>
                 <w:sz w:val="18"/>
               </w:rPr>
-              <w:t>• Obecně nezávislí trenéři a trenérky s 5–20 klienty, kteří dnes dávají zpětnou vazbu např. přes WhatsApp.</w:t>
+              <w:t xml:space="preserve">• Trenéři s desítkami klientů měsíčně, kteří klientům dávají úkoly na celý měsíc a už s nimi konzultují přes WhatsApp.</w:t>
             </w:r>
           </w:p>
         </w:tc>

</xml_diff>

<commit_message>
docs: jeden model po FB2, ceník a šablona user story
PO na FB2 potvrdil, že psovod může aplikaci používat i sám a zve
vždycky trenér. Lean Canvas 1.4 (md i docx) nahrazuje verzi 1.3
i variantu B. Tarify Solo/Pro nahradila platba za aktivního klienta
(3 zdarma, 49 Kč za dalšího, strop 1 490 Kč) včetně přepočtu
v nákladové struktuře. Breakdown (nové F-47 a F-48), sitemapa,
otázky na FB2 a upravený plán sladěné. Šablona issue pro user stories.

Co-Authored-By: Claude Opus 5.5 <noreply@anthropic.com>
</commit_message>
<xml_diff>
--- a/docs/vystupy/lean-canvas.docx
+++ b/docs/vystupy/lean-canvas.docx
@@ -359,13 +359,13 @@
                 <w:rFonts w:ascii="Arial" w:hAnsi="Arial"/>
               </w:rPr>
             </w:pPr>
-            <w:r/>
-            <w:r>
-              <w:rPr>
-                <w:rFonts w:ascii="Arial" w:hAnsi="Arial"/>
+            <w:r>
+              <w:rPr>
+                <w:rFonts w:ascii="Arial" w:hAnsi="Arial"/>
+                <w:b w:val="0"/>
                 <w:sz w:val="20"/>
               </w:rPr>
-              <w:t xml:space="preserve">1.3</w:t>
+              <w:t xml:space="preserve">1.4</w:t>
             </w:r>
           </w:p>
         </w:tc>
@@ -634,7 +634,6 @@
                 <w:sz w:val="20"/>
               </w:rPr>
             </w:pPr>
-            <w:r/>
             <w:r>
               <w:rPr>
                 <w:rFonts w:ascii="Arial" w:hAnsi="Arial"/>
@@ -671,6 +670,20 @@
                 <w:sz w:val="18"/>
               </w:rPr>
               <w:t xml:space="preserve">• Trenér opakovaně vysvětluje totéž („A jak bylo tohle?“)</w:t>
+            </w:r>
+          </w:p>
+          <w:p>
+            <w:pPr>
+              <w:spacing w:before="0" w:after="40" w:line="252" w:lineRule="auto"/>
+            </w:pPr>
+            <w:r>
+              <w:rPr>
+                <w:rFonts w:ascii="Arial" w:hAnsi="Arial"/>
+                <w:b w:val="0"/>
+                <w:color w:val="000000"/>
+                <w:sz w:val="18"/>
+              </w:rPr>
+              <w:t xml:space="preserve">• Ze seminářů si psovod odnese jen to, co si stihne zapsat</w:t>
             </w:r>
           </w:p>
         </w:tc>
@@ -694,15 +707,92 @@
                 <w:lang w:val="it-IT"/>
               </w:rPr>
             </w:pPr>
-            <w:r/>
-            <w:r>
-              <w:rPr>
-                <w:rFonts w:ascii="Arial" w:hAnsi="Arial"/>
-                <w:b w:val="0"/>
-                <w:color w:val="000000"/>
-                <w:sz w:val="19"/>
-              </w:rPr>
-              <w:t xml:space="preserve">Responzivní webová aplikace (optimalizovaná pro mobilní telefony / PWA) pro trenéra a jeho klienty. Trenér zadá plán: nejdřív princip a na co si dát pozor, pak cviky s instrukcí a kritériem zvládnutí. Klient ho má v týdenním kalendáři, trénink může přesunout nebo přeskočit a k odcvičenému tréninku pošle výsledek, poznámku a odkaz na video. Trenér odpoví ve vlákně u tréninku a rovnou upraví plán.</w:t>
+            <w:r>
+              <w:rPr>
+                <w:rFonts w:ascii="Arial" w:hAnsi="Arial"/>
+                <w:b w:val="0"/>
+                <w:color w:val="000000"/>
+                <w:sz w:val="19"/>
+              </w:rPr>
+              <w:t xml:space="preserve">Webová aplikace pro mobil (PWA):</w:t>
+            </w:r>
+          </w:p>
+          <w:p>
+            <w:pPr>
+              <w:spacing w:before="0" w:after="40" w:line="252" w:lineRule="auto"/>
+            </w:pPr>
+            <w:r>
+              <w:rPr>
+                <w:rFonts w:ascii="Arial" w:hAnsi="Arial"/>
+                <w:b w:val="0"/>
+                <w:color w:val="000000"/>
+                <w:sz w:val="19"/>
+              </w:rPr>
+              <w:t xml:space="preserve">• </w:t>
+            </w:r>
+            <w:r>
+              <w:rPr>
+                <w:rFonts w:ascii="Arial" w:hAnsi="Arial"/>
+                <w:b/>
+                <w:color w:val="000000"/>
+                <w:sz w:val="19"/>
+              </w:rPr>
+              <w:t xml:space="preserve">Deník psa:</w:t>
+            </w:r>
+            <w:r>
+              <w:rPr>
+                <w:rFonts w:ascii="Arial" w:hAnsi="Arial"/>
+                <w:b w:val="0"/>
+                <w:color w:val="000000"/>
+                <w:sz w:val="19"/>
+              </w:rPr>
+              <w:t xml:space="preserve"> poznámky z lekcí a seminářů a plán krok po kroku. Funguje i bez trenéra.</w:t>
+            </w:r>
+          </w:p>
+          <w:p>
+            <w:pPr>
+              <w:spacing w:before="0" w:after="40" w:line="252" w:lineRule="auto"/>
+            </w:pPr>
+            <w:r>
+              <w:rPr>
+                <w:rFonts w:ascii="Arial" w:hAnsi="Arial"/>
+                <w:b w:val="0"/>
+                <w:color w:val="000000"/>
+                <w:sz w:val="19"/>
+              </w:rPr>
+              <w:t xml:space="preserve">• </w:t>
+            </w:r>
+            <w:r>
+              <w:rPr>
+                <w:rFonts w:ascii="Arial" w:hAnsi="Arial"/>
+                <w:b/>
+                <w:color w:val="000000"/>
+                <w:sz w:val="19"/>
+              </w:rPr>
+              <w:t xml:space="preserve">Zadání od trenéra:</w:t>
+            </w:r>
+            <w:r>
+              <w:rPr>
+                <w:rFonts w:ascii="Arial" w:hAnsi="Arial"/>
+                <w:b w:val="0"/>
+                <w:color w:val="000000"/>
+                <w:sz w:val="19"/>
+              </w:rPr>
+              <w:t xml:space="preserve"> princip, pak cviky s instrukcí a kritériem zvládnutí.</w:t>
+            </w:r>
+          </w:p>
+          <w:p>
+            <w:pPr>
+              <w:spacing w:before="0" w:after="40" w:line="252" w:lineRule="auto"/>
+            </w:pPr>
+            <w:r>
+              <w:rPr>
+                <w:rFonts w:ascii="Arial" w:hAnsi="Arial"/>
+                <w:b w:val="0"/>
+                <w:color w:val="000000"/>
+                <w:sz w:val="19"/>
+              </w:rPr>
+              <w:t xml:space="preserve">• Týden s přesunem a přeskočením, záznam s odkazem na video a vlákno s trenérem u tréninku.</w:t>
             </w:r>
           </w:p>
         </w:tc>
@@ -720,29 +810,46 @@
             <w:pPr>
               <w:spacing w:before="0" w:after="100" w:line="252" w:lineRule="auto"/>
             </w:pPr>
-            <w:r/>
-            <w:r>
-              <w:rPr>
-                <w:rFonts w:ascii="Arial" w:hAnsi="Arial"/>
-                <w:b w:val="0"/>
-                <w:color w:val="000000"/>
-                <w:sz w:val="19"/>
-              </w:rPr>
-              <w:t xml:space="preserve">Vaši klienti doma přesně vědí, co a jak cvičit, a vy nemusíte totéž vysvětlovat znovu.</w:t>
-            </w:r>
-          </w:p>
-          <w:p>
-            <w:pPr>
-              <w:spacing w:before="0" w:after="40" w:line="252" w:lineRule="auto"/>
-            </w:pPr>
-            <w:r>
-              <w:rPr>
-                <w:rFonts w:ascii="Arial" w:hAnsi="Arial"/>
-                <w:b w:val="0"/>
-                <w:color w:val="000000"/>
-                <w:sz w:val="19"/>
-              </w:rPr>
-              <w:t xml:space="preserve">Zadání z lekce v telefonu klienta, týden v kalendáři a dotaz s videem u konkrétního tréninku. Celý výcvik psa na jednom místě.</w:t>
+            <w:r>
+              <w:rPr>
+                <w:rFonts w:ascii="Arial" w:hAnsi="Arial"/>
+                <w:b/>
+                <w:color w:val="000000"/>
+                <w:sz w:val="19"/>
+              </w:rPr>
+              <w:t xml:space="preserve">Pro psovoda:</w:t>
+            </w:r>
+            <w:r>
+              <w:rPr>
+                <w:rFonts w:ascii="Arial" w:hAnsi="Arial"/>
+                <w:b w:val="0"/>
+                <w:color w:val="000000"/>
+                <w:sz w:val="19"/>
+              </w:rPr>
+              <w:t xml:space="preserve"> Co ti trenér řekl, máš u psa. Krok po kroku, i na place.</w:t>
+            </w:r>
+          </w:p>
+          <w:p>
+            <w:pPr>
+              <w:spacing w:before="0" w:after="40" w:line="252" w:lineRule="auto"/>
+            </w:pPr>
+            <w:r>
+              <w:rPr>
+                <w:rFonts w:ascii="Arial" w:hAnsi="Arial"/>
+                <w:b/>
+                <w:color w:val="000000"/>
+                <w:sz w:val="19"/>
+              </w:rPr>
+              <w:t xml:space="preserve">Pro trenéra:</w:t>
+            </w:r>
+            <w:r>
+              <w:rPr>
+                <w:rFonts w:ascii="Arial" w:hAnsi="Arial"/>
+                <w:b w:val="0"/>
+                <w:color w:val="000000"/>
+                <w:sz w:val="19"/>
+              </w:rPr>
+              <w:t xml:space="preserve"> Klienti doma vědí, co a jak cvičit. Podporu mezi lekcemi, kterou dnes dáváte zdarma přes WhatsApp, můžete prodávat.</w:t>
             </w:r>
           </w:p>
         </w:tc>
@@ -794,7 +901,6 @@
               <w:spacing w:before="0" w:after="100" w:line="252" w:lineRule="auto"/>
               <w:ind w:right="-18"/>
             </w:pPr>
-            <w:r/>
             <w:r>
               <w:rPr>
                 <w:rFonts w:ascii="Arial" w:hAnsi="Arial"/>
@@ -811,7 +917,7 @@
                 <w:color w:val="000000"/>
                 <w:sz w:val="19"/>
               </w:rPr>
-              <w:t xml:space="preserve"> Nezávislí trenéři, trenérky a psí školy, kteří vedou desítky klientů. Klienti chodí na lekci zhruba 1× měsíčně a mezi lekcemi trénují sami podle zadání.</w:t>
+              <w:t xml:space="preserve"> Trenéři a psí školy s desítkami klientů, kteří chodí na lekci cca 1× měsíčně. Chtějí jim prodávat podporu mezi lekcemi.</w:t>
             </w:r>
           </w:p>
           <w:p>
@@ -834,7 +940,7 @@
                 <w:color w:val="000000"/>
                 <w:sz w:val="19"/>
               </w:rPr>
-              <w:t xml:space="preserve"> Psovodi, kteří s jedním či více psy trénují pod vedením trenéra a dostávají úkoly na doma.</w:t>
+              <w:t xml:space="preserve"> Psovodi, kteří chodí na lekce a semináře, s trenérem i bez něj.</w:t>
             </w:r>
           </w:p>
         </w:tc>
@@ -1006,7 +1112,6 @@
                 <w:sz w:val="20"/>
               </w:rPr>
             </w:pPr>
-            <w:r/>
             <w:r>
               <w:rPr>
                 <w:rFonts w:ascii="Arial" w:hAnsi="Arial"/>
@@ -1042,7 +1147,7 @@
                 <w:color w:val="000000"/>
                 <w:sz w:val="19"/>
               </w:rPr>
-              <w:t xml:space="preserve">• Papírové deníky trenéra (zvlášť na psa a sport)</w:t>
+              <w:t xml:space="preserve">• Papírové deníky (zvlášť na psa a sport)</w:t>
             </w:r>
           </w:p>
           <w:p>
@@ -1057,6 +1162,20 @@
                 <w:sz w:val="19"/>
               </w:rPr>
               <w:t xml:space="preserve">• Excel</w:t>
+            </w:r>
+          </w:p>
+          <w:p>
+            <w:pPr>
+              <w:spacing w:before="0" w:after="40" w:line="252" w:lineRule="auto"/>
+            </w:pPr>
+            <w:r>
+              <w:rPr>
+                <w:rFonts w:ascii="Arial" w:hAnsi="Arial"/>
+                <w:b w:val="0"/>
+                <w:color w:val="000000"/>
+                <w:sz w:val="19"/>
+              </w:rPr>
+              <w:t xml:space="preserve">• Paměť trenéra</w:t>
             </w:r>
           </w:p>
         </w:tc>
@@ -1079,7 +1198,6 @@
                 <w:sz w:val="20"/>
               </w:rPr>
             </w:pPr>
-            <w:r/>
             <w:r>
               <w:rPr>
                 <w:rFonts w:ascii="Arial" w:hAnsi="Arial"/>
@@ -1087,17 +1205,27 @@
                 <w:color w:val="000000"/>
                 <w:sz w:val="18"/>
               </w:rPr>
-              <w:t xml:space="preserve">• </w:t>
-            </w:r>
-            <w:r>
-              <w:rPr>
-                <w:rFonts w:ascii="Arial" w:hAnsi="Arial"/>
-                <w:b/>
+              <w:t xml:space="preserve">• 10 platících trenérů do 6 měsíců od spuštění pilotu</w:t>
+            </w:r>
+          </w:p>
+          <w:p>
+            <w:pPr>
+              <w:spacing w:before="0" w:after="40" w:line="252" w:lineRule="auto"/>
+            </w:pPr>
+            <w:r>
+              <w:rPr>
+                <w:rFonts w:ascii="Arial" w:hAnsi="Arial"/>
+                <w:b w:val="0"/>
                 <w:color w:val="000000"/>
                 <w:sz w:val="18"/>
               </w:rPr>
-              <w:t>10 platících trenérů</w:t>
-            </w:r>
+              <w:t xml:space="preserve">• Minimálně 50 psů aktivně vedených v aplikaci</w:t>
+            </w:r>
+          </w:p>
+          <w:p>
+            <w:pPr>
+              <w:spacing w:before="0" w:after="40" w:line="252" w:lineRule="auto"/>
+            </w:pPr>
             <w:r>
               <w:rPr>
                 <w:rFonts w:ascii="Arial" w:hAnsi="Arial"/>
@@ -1105,7 +1233,7 @@
                 <w:color w:val="000000"/>
                 <w:sz w:val="18"/>
               </w:rPr>
-              <w:t xml:space="preserve"> do 6 měsíců od spuštění pilotu</w:t>
+              <w:t xml:space="preserve">• ≥ 50 % klientů otevře zadání mezi lekcemi 1× týdně</w:t>
             </w:r>
           </w:p>
           <w:p>
@@ -1119,89 +1247,21 @@
                 <w:color w:val="000000"/>
                 <w:sz w:val="18"/>
               </w:rPr>
-              <w:t xml:space="preserve">• </w:t>
-            </w:r>
-            <w:r>
-              <w:rPr>
-                <w:rFonts w:ascii="Arial" w:hAnsi="Arial"/>
-                <w:b/>
+              <w:t xml:space="preserve">• ≥ 50 % dotazů a videí od klientů jde přes TrainLoop místo WhatsAppu</w:t>
+            </w:r>
+          </w:p>
+          <w:p>
+            <w:pPr>
+              <w:spacing w:before="0" w:after="40" w:line="252" w:lineRule="auto"/>
+            </w:pPr>
+            <w:r>
+              <w:rPr>
+                <w:rFonts w:ascii="Arial" w:hAnsi="Arial"/>
+                <w:b w:val="0"/>
                 <w:color w:val="000000"/>
                 <w:sz w:val="18"/>
               </w:rPr>
-              <w:t>Minimálně 50 psů</w:t>
-            </w:r>
-            <w:r>
-              <w:rPr>
-                <w:rFonts w:ascii="Arial" w:hAnsi="Arial"/>
-                <w:b w:val="0"/>
-                <w:color w:val="000000"/>
-                <w:sz w:val="18"/>
-              </w:rPr>
-              <w:t xml:space="preserve"> aktivně vedených v aplikaci</w:t>
-            </w:r>
-          </w:p>
-          <w:p>
-            <w:pPr>
-              <w:spacing w:before="0" w:after="40" w:line="252" w:lineRule="auto"/>
-            </w:pPr>
-            <w:r>
-              <w:rPr>
-                <w:rFonts w:ascii="Arial" w:hAnsi="Arial"/>
-                <w:b w:val="0"/>
-                <w:color w:val="000000"/>
-                <w:sz w:val="18"/>
-              </w:rPr>
-              <w:t xml:space="preserve">• </w:t>
-            </w:r>
-            <w:r>
-              <w:rPr>
-                <w:rFonts w:ascii="Arial" w:hAnsi="Arial"/>
-                <w:b/>
-                <w:color w:val="000000"/>
-                <w:sz w:val="18"/>
-              </w:rPr>
-              <w:t xml:space="preserve">Používání zadání:</w:t>
-            </w:r>
-            <w:r>
-              <w:rPr>
-                <w:rFonts w:ascii="Arial" w:hAnsi="Arial"/>
-                <w:b w:val="0"/>
-                <w:color w:val="000000"/>
-                <w:sz w:val="18"/>
-              </w:rPr>
-              <w:t xml:space="preserve"> ≥ 50 % klientů otevře zadání mezi lekcemi alespoň 1× týdně</w:t>
-            </w:r>
-          </w:p>
-          <w:p>
-            <w:pPr>
-              <w:spacing w:before="0" w:after="40" w:line="252" w:lineRule="auto"/>
-            </w:pPr>
-            <w:r>
-              <w:rPr>
-                <w:rFonts w:ascii="Arial" w:hAnsi="Arial"/>
-                <w:b w:val="0"/>
-                <w:color w:val="000000"/>
-                <w:sz w:val="18"/>
-              </w:rPr>
-              <w:t xml:space="preserve">• </w:t>
-            </w:r>
-            <w:r>
-              <w:rPr>
-                <w:rFonts w:ascii="Arial" w:hAnsi="Arial"/>
-                <w:b/>
-                <w:color w:val="000000"/>
-                <w:sz w:val="18"/>
-              </w:rPr>
-              <w:t xml:space="preserve">Náhrada WhatsAppu:</w:t>
-            </w:r>
-            <w:r>
-              <w:rPr>
-                <w:rFonts w:ascii="Arial" w:hAnsi="Arial"/>
-                <w:b w:val="0"/>
-                <w:color w:val="000000"/>
-                <w:sz w:val="18"/>
-              </w:rPr>
-              <w:t xml:space="preserve"> ≥ 50 % dotazů a videí od klientů přichází přes TrainLoop (podle trenérů v pilotu)</w:t>
+              <w:t xml:space="preserve">• Psovodi bez trenéra otevřou deník 1× týdně</w:t>
             </w:r>
           </w:p>
         </w:tc>
@@ -1219,15 +1279,14 @@
             <w:pPr>
               <w:spacing w:before="0" w:after="40" w:line="252" w:lineRule="auto"/>
             </w:pPr>
-            <w:r/>
-            <w:r>
-              <w:rPr>
-                <w:rFonts w:ascii="Arial" w:hAnsi="Arial"/>
-                <w:b w:val="0"/>
-                <w:color w:val="000000"/>
-                <w:sz w:val="19"/>
-              </w:rPr>
-              <w:t>TrueCoach / TrainingPeaks pro trenéry psů</w:t>
+            <w:r>
+              <w:rPr>
+                <w:rFonts w:ascii="Arial" w:hAnsi="Arial"/>
+                <w:b w:val="0"/>
+                <w:color w:val="000000"/>
+                <w:sz w:val="19"/>
+              </w:rPr>
+              <w:t xml:space="preserve">Deník psa s trenérem uvnitř (TrainingPeaks pro psí sporty)</w:t>
             </w:r>
           </w:p>
         </w:tc>
@@ -1246,29 +1305,56 @@
               <w:spacing w:before="0" w:after="40" w:line="252" w:lineRule="auto"/>
               <w:ind w:right="-10"/>
             </w:pPr>
-            <w:r/>
-            <w:r>
-              <w:rPr>
-                <w:rFonts w:ascii="Arial" w:hAnsi="Arial"/>
-                <w:b w:val="0"/>
-                <w:color w:val="000000"/>
-                <w:sz w:val="19"/>
-              </w:rPr>
-              <w:t>• Osobní oslovení trenérů a psích škol (přes kontakty PO a psí akce)</w:t>
-            </w:r>
-          </w:p>
-          <w:p>
-            <w:pPr>
-              <w:spacing w:before="0" w:after="40" w:line="252" w:lineRule="auto"/>
-            </w:pPr>
-            <w:r>
-              <w:rPr>
-                <w:rFonts w:ascii="Arial" w:hAnsi="Arial"/>
-                <w:b w:val="0"/>
-                <w:color w:val="000000"/>
-                <w:sz w:val="19"/>
-              </w:rPr>
-              <w:t>• Přirozená virální smyčka: trenér onboarduje své klienty</w:t>
+            <w:r>
+              <w:rPr>
+                <w:rFonts w:ascii="Arial" w:hAnsi="Arial"/>
+                <w:b w:val="0"/>
+                <w:color w:val="000000"/>
+                <w:sz w:val="19"/>
+              </w:rPr>
+              <w:t xml:space="preserve">• Osobní oslovení trenérů a psích škol (přes kontakty PO a psí akce)</w:t>
+            </w:r>
+          </w:p>
+          <w:p>
+            <w:pPr>
+              <w:spacing w:before="0" w:after="40" w:line="252" w:lineRule="auto"/>
+            </w:pPr>
+            <w:r>
+              <w:rPr>
+                <w:rFonts w:ascii="Arial" w:hAnsi="Arial"/>
+                <w:b w:val="0"/>
+                <w:color w:val="000000"/>
+                <w:sz w:val="19"/>
+              </w:rPr>
+              <w:t xml:space="preserve">• Trenér pozve své klienty</w:t>
+            </w:r>
+          </w:p>
+          <w:p>
+            <w:pPr>
+              <w:spacing w:before="0" w:after="40" w:line="252" w:lineRule="auto"/>
+            </w:pPr>
+            <w:r>
+              <w:rPr>
+                <w:rFonts w:ascii="Arial" w:hAnsi="Arial"/>
+                <w:b w:val="0"/>
+                <w:color w:val="000000"/>
+                <w:sz w:val="19"/>
+              </w:rPr>
+              <w:t xml:space="preserve">• Psovodi z okolí PO (deník zdarma)</w:t>
+            </w:r>
+          </w:p>
+          <w:p>
+            <w:pPr>
+              <w:spacing w:before="0" w:after="40" w:line="252" w:lineRule="auto"/>
+            </w:pPr>
+            <w:r>
+              <w:rPr>
+                <w:rFonts w:ascii="Arial" w:hAnsi="Arial"/>
+                <w:b w:val="0"/>
+                <w:color w:val="000000"/>
+                <w:sz w:val="19"/>
+              </w:rPr>
+              <w:t xml:space="preserve">• Psovod řekne trenérovi „pošli mi zadání sem“, trenér si založí účet a pozve ho</w:t>
             </w:r>
           </w:p>
         </w:tc>
@@ -1287,7 +1373,6 @@
               <w:spacing w:before="0" w:after="80" w:line="252" w:lineRule="auto"/>
               <w:ind w:right="-10"/>
             </w:pPr>
-            <w:r/>
             <w:r>
               <w:rPr>
                 <w:rFonts w:ascii="Arial" w:hAnsi="Arial"/>
@@ -1295,7 +1380,7 @@
                 <w:color w:val="000000"/>
                 <w:sz w:val="18"/>
               </w:rPr>
-              <w:t>• Lidé, se kterými už trénuje Veronika (PO): její trenéři a trenérky a jejich klienti.</w:t>
+              <w:t xml:space="preserve">• Lidé, se kterými už trénuje Veronika (PO): její trenéři a trenérky a jejich klienti.</w:t>
             </w:r>
           </w:p>
           <w:p>
@@ -1309,7 +1394,21 @@
                 <w:color w:val="000000"/>
                 <w:sz w:val="18"/>
               </w:rPr>
-              <w:t xml:space="preserve">• Nezávislí trenéři a trenérky, kteří dávají zadání ústně na lekci a mezi lekcemi odpovídají klientům přes WhatsApp.</w:t>
+              <w:t xml:space="preserve">• Trenéři, kteří dávají zadání ústně a mezi lekcemi odpovídají přes WhatsApp.</w:t>
+            </w:r>
+          </w:p>
+          <w:p>
+            <w:pPr>
+              <w:spacing w:before="0" w:after="40" w:line="252" w:lineRule="auto"/>
+            </w:pPr>
+            <w:r>
+              <w:rPr>
+                <w:rFonts w:ascii="Arial" w:hAnsi="Arial"/>
+                <w:b w:val="0"/>
+                <w:color w:val="000000"/>
+                <w:sz w:val="18"/>
+              </w:rPr>
+              <w:t xml:space="preserve">• Psovodi, kteří vedou papírový deník a jezdí na semináře.</w:t>
             </w:r>
           </w:p>
         </w:tc>
@@ -1475,7 +1574,6 @@
               <w:spacing w:before="0" w:after="40" w:line="252" w:lineRule="auto"/>
               <w:ind w:right="-18"/>
             </w:pPr>
-            <w:r/>
             <w:r>
               <w:rPr>
                 <w:rFonts w:ascii="Arial" w:hAnsi="Arial"/>
@@ -1483,49 +1581,77 @@
                 <w:color w:val="000000"/>
                 <w:sz w:val="19"/>
               </w:rPr>
-              <w:t>B2B SaaS předplatné pro trenéry:</w:t>
-            </w:r>
-          </w:p>
-          <w:p>
-            <w:pPr>
-              <w:spacing w:before="0" w:after="40" w:line="252" w:lineRule="auto"/>
-            </w:pPr>
-            <w:r>
-              <w:rPr>
-                <w:rFonts w:ascii="Arial" w:hAnsi="Arial"/>
-                <w:b w:val="0"/>
-                <w:color w:val="000000"/>
-                <w:sz w:val="19"/>
-              </w:rPr>
-              <w:t>• Solo trenér: 490 Kč / měsíc (do 15 aktivních psů)</w:t>
-            </w:r>
-          </w:p>
-          <w:p>
-            <w:pPr>
-              <w:spacing w:before="0" w:after="40" w:line="252" w:lineRule="auto"/>
-            </w:pPr>
-            <w:r>
-              <w:rPr>
-                <w:rFonts w:ascii="Arial" w:hAnsi="Arial"/>
-                <w:b w:val="0"/>
-                <w:color w:val="000000"/>
-                <w:sz w:val="19"/>
-              </w:rPr>
-              <w:t>• Psí škola / Pro: 990 Kč / měsíc (neomezeně psů)</w:t>
-            </w:r>
-          </w:p>
-          <w:p>
-            <w:pPr>
-              <w:spacing w:before="0" w:after="40" w:line="252" w:lineRule="auto"/>
-            </w:pPr>
-            <w:r>
-              <w:rPr>
-                <w:rFonts w:ascii="Arial" w:hAnsi="Arial"/>
-                <w:b w:val="0"/>
-                <w:color w:val="000000"/>
-                <w:sz w:val="19"/>
-              </w:rPr>
-              <w:t>• Pro psovody: 0 Kč (včetně více psů v rámci výcviku pod trenérem)</w:t>
+              <w:t xml:space="preserve">Trenér platí za aktivního klienta:</w:t>
+            </w:r>
+          </w:p>
+          <w:p>
+            <w:pPr>
+              <w:spacing w:before="0" w:after="40" w:line="252" w:lineRule="auto"/>
+            </w:pPr>
+            <w:r>
+              <w:rPr>
+                <w:rFonts w:ascii="Arial" w:hAnsi="Arial"/>
+                <w:b w:val="0"/>
+                <w:color w:val="000000"/>
+                <w:sz w:val="19"/>
+              </w:rPr>
+              <w:t xml:space="preserve">• První 3 aktivní klienti zdarma</w:t>
+            </w:r>
+          </w:p>
+          <w:p>
+            <w:pPr>
+              <w:spacing w:before="0" w:after="40" w:line="252" w:lineRule="auto"/>
+            </w:pPr>
+            <w:r>
+              <w:rPr>
+                <w:rFonts w:ascii="Arial" w:hAnsi="Arial"/>
+                <w:b w:val="0"/>
+                <w:color w:val="000000"/>
+                <w:sz w:val="19"/>
+              </w:rPr>
+              <w:t xml:space="preserve">• 49 Kč / měsíc za každého dalšího aktivního klienta</w:t>
+            </w:r>
+          </w:p>
+          <w:p>
+            <w:pPr>
+              <w:spacing w:before="0" w:after="40" w:line="252" w:lineRule="auto"/>
+            </w:pPr>
+            <w:r>
+              <w:rPr>
+                <w:rFonts w:ascii="Arial" w:hAnsi="Arial"/>
+                <w:b w:val="0"/>
+                <w:color w:val="000000"/>
+                <w:sz w:val="19"/>
+              </w:rPr>
+              <w:t xml:space="preserve">• Strop 1 490 Kč / měsíc (od 34 aktivních klientů dál zdarma)</w:t>
+            </w:r>
+          </w:p>
+          <w:p>
+            <w:pPr>
+              <w:spacing w:before="0" w:after="40" w:line="252" w:lineRule="auto"/>
+            </w:pPr>
+            <w:r>
+              <w:rPr>
+                <w:rFonts w:ascii="Arial" w:hAnsi="Arial"/>
+                <w:b w:val="0"/>
+                <w:color w:val="000000"/>
+                <w:sz w:val="19"/>
+              </w:rPr>
+              <w:t xml:space="preserve">• Psovod: 0 Kč, s trenérem i bez něj, i s více psy</w:t>
+            </w:r>
+          </w:p>
+          <w:p>
+            <w:pPr>
+              <w:spacing w:before="0" w:after="40" w:line="252" w:lineRule="auto"/>
+            </w:pPr>
+            <w:r>
+              <w:rPr>
+                <w:rFonts w:ascii="Arial" w:hAnsi="Arial"/>
+                <w:b w:val="0"/>
+                <w:color w:val="000000"/>
+                <w:sz w:val="19"/>
+              </w:rPr>
+              <w:t xml:space="preserve">• Trenér si podporu mezi lekcemi promítne do ceny lekcí</w:t>
             </w:r>
           </w:p>
         </w:tc>

</xml_diff>

<commit_message>
docs: zapracování hodnocení Sprintu 1 (Lean Canvas 1.5, breakdown 32 features, komunikace s PO)
</commit_message>
<xml_diff>
--- a/docs/vystupy/lean-canvas.docx
+++ b/docs/vystupy/lean-canvas.docx
@@ -320,7 +320,7 @@
               <w:rPr>
                 <w:rFonts w:ascii="Arial" w:hAnsi="Arial"/>
               </w:rPr>
-              <w:t>9.10.2026</w:t>
+              <w:t>16.10.2026</w:t>
             </w:r>
           </w:p>
         </w:tc>
@@ -365,7 +365,7 @@
                 <w:b w:val="0"/>
                 <w:sz w:val="20"/>
               </w:rPr>
-              <w:t xml:space="preserve">1.4</w:t>
+              <w:t xml:space="preserve">1.5</w:t>
             </w:r>
           </w:p>
         </w:tc>
@@ -1201,67 +1201,100 @@
             <w:r>
               <w:rPr>
                 <w:rFonts w:ascii="Arial" w:hAnsi="Arial"/>
-                <w:b w:val="0"/>
                 <w:color w:val="000000"/>
                 <w:sz w:val="18"/>
               </w:rPr>
-              <w:t xml:space="preserve">• 10 platících trenérů do 6 měsíců od spuštění pilotu</w:t>
-            </w:r>
-          </w:p>
-          <w:p>
-            <w:pPr>
-              <w:spacing w:before="0" w:after="40" w:line="252" w:lineRule="auto"/>
-            </w:pPr>
-            <w:r>
-              <w:rPr>
-                <w:rFonts w:ascii="Arial" w:hAnsi="Arial"/>
-                <w:b w:val="0"/>
+              <w:t xml:space="preserve">• Měsíční příjem 20 000 Kč v 15. měsíci = měsíční bod zvratu (≈ 34 platících trenérů)</w:t>
+            </w:r>
+          </w:p>
+          <w:p>
+            <w:pPr>
+              <w:spacing w:before="0" w:after="40" w:line="252" w:lineRule="auto"/>
+              <w:rPr>
+                <w:rFonts w:ascii="Arial" w:hAnsi="Arial"/>
+                <w:color w:val="808080" w:themeColor="background1" w:themeShade="80"/>
+                <w:sz w:val="20"/>
+              </w:rPr>
+            </w:pPr>
+            <w:r>
+              <w:rPr>
+                <w:rFonts w:ascii="Arial" w:hAnsi="Arial"/>
                 <w:color w:val="000000"/>
                 <w:sz w:val="18"/>
               </w:rPr>
-              <w:t xml:space="preserve">• Minimálně 50 psů aktivně vedených v aplikaci</w:t>
-            </w:r>
-          </w:p>
-          <w:p>
-            <w:pPr>
-              <w:spacing w:before="0" w:after="40" w:line="252" w:lineRule="auto"/>
-            </w:pPr>
-            <w:r>
-              <w:rPr>
-                <w:rFonts w:ascii="Arial" w:hAnsi="Arial"/>
-                <w:b w:val="0"/>
+              <w:t xml:space="preserve">• ≥ 40 % trenérů z pilotu začne do 3 měsíců platit (má 4. aktivního klienta)</w:t>
+            </w:r>
+          </w:p>
+          <w:p>
+            <w:pPr>
+              <w:spacing w:before="0" w:after="40" w:line="252" w:lineRule="auto"/>
+              <w:rPr>
+                <w:rFonts w:ascii="Arial" w:hAnsi="Arial"/>
+                <w:color w:val="808080" w:themeColor="background1" w:themeShade="80"/>
+                <w:sz w:val="20"/>
+              </w:rPr>
+            </w:pPr>
+            <w:r>
+              <w:rPr>
+                <w:rFonts w:ascii="Arial" w:hAnsi="Arial"/>
                 <w:color w:val="000000"/>
                 <w:sz w:val="18"/>
               </w:rPr>
-              <w:t xml:space="preserve">• ≥ 50 % klientů otevře zadání mezi lekcemi 1× týdně</w:t>
-            </w:r>
-          </w:p>
-          <w:p>
-            <w:pPr>
-              <w:spacing w:before="0" w:after="40" w:line="252" w:lineRule="auto"/>
-            </w:pPr>
-            <w:r>
-              <w:rPr>
-                <w:rFonts w:ascii="Arial" w:hAnsi="Arial"/>
-                <w:b w:val="0"/>
+              <w:t xml:space="preserve">• Odchod platících trenérů ≤ 3 % měsíčně</w:t>
+            </w:r>
+          </w:p>
+          <w:p>
+            <w:pPr>
+              <w:spacing w:before="0" w:after="40" w:line="252" w:lineRule="auto"/>
+              <w:rPr>
+                <w:rFonts w:ascii="Arial" w:hAnsi="Arial"/>
+                <w:color w:val="808080" w:themeColor="background1" w:themeShade="80"/>
+                <w:sz w:val="20"/>
+              </w:rPr>
+            </w:pPr>
+            <w:r>
+              <w:rPr>
+                <w:rFonts w:ascii="Arial" w:hAnsi="Arial"/>
                 <w:color w:val="000000"/>
                 <w:sz w:val="18"/>
               </w:rPr>
-              <w:t xml:space="preserve">• ≥ 50 % dotazů a videí od klientů jde přes TrainLoop místo WhatsAppu</w:t>
-            </w:r>
-          </w:p>
-          <w:p>
-            <w:pPr>
-              <w:spacing w:before="0" w:after="40" w:line="252" w:lineRule="auto"/>
-            </w:pPr>
-            <w:r>
-              <w:rPr>
-                <w:rFonts w:ascii="Arial" w:hAnsi="Arial"/>
-                <w:b w:val="0"/>
+              <w:t xml:space="preserve">• Průměrně ≥ 15 aktivních klientů na trenéra (588 Kč měsíčně)</w:t>
+            </w:r>
+          </w:p>
+          <w:p>
+            <w:pPr>
+              <w:spacing w:before="0" w:after="40" w:line="252" w:lineRule="auto"/>
+              <w:rPr>
+                <w:rFonts w:ascii="Arial" w:hAnsi="Arial"/>
+                <w:color w:val="808080" w:themeColor="background1" w:themeShade="80"/>
+                <w:sz w:val="20"/>
+              </w:rPr>
+            </w:pPr>
+            <w:r>
+              <w:rPr>
+                <w:rFonts w:ascii="Arial" w:hAnsi="Arial"/>
                 <w:color w:val="000000"/>
                 <w:sz w:val="18"/>
               </w:rPr>
-              <w:t xml:space="preserve">• Psovodi bez trenéra otevřou deník 1× týdně</w:t>
+              <w:t xml:space="preserve">• Získání trenéra ≤ 1 500 Kč, vrátí se do 3 měsíců</w:t>
+            </w:r>
+          </w:p>
+          <w:p>
+            <w:pPr>
+              <w:spacing w:before="0" w:after="40" w:line="252" w:lineRule="auto"/>
+              <w:rPr>
+                <w:rFonts w:ascii="Arial" w:hAnsi="Arial"/>
+                <w:color w:val="808080" w:themeColor="background1" w:themeShade="80"/>
+                <w:sz w:val="20"/>
+              </w:rPr>
+            </w:pPr>
+            <w:r>
+              <w:rPr>
+                <w:rFonts w:ascii="Arial" w:hAnsi="Arial"/>
+                <w:color w:val="000000"/>
+                <w:sz w:val="18"/>
+              </w:rPr>
+              <w:t xml:space="preserve">• Předstihový ukazatel: ≥ 50 % klientů otevře zadání mezi lekcemi 1× týdně</w:t>
             </w:r>
           </w:p>
         </w:tc>
@@ -1282,11 +1315,10 @@
             <w:r>
               <w:rPr>
                 <w:rFonts w:ascii="Arial" w:hAnsi="Arial"/>
-                <w:b w:val="0"/>
                 <w:color w:val="000000"/>
                 <w:sz w:val="19"/>
               </w:rPr>
-              <w:t xml:space="preserve">Deník psa s trenérem uvnitř (TrainingPeaks pro psí sporty)</w:t>
+              <w:t xml:space="preserve">Deník psa, do kterého píše i trenér (TrainingPeaks pro psí sporty)</w:t>
             </w:r>
           </w:p>
         </w:tc>
@@ -1492,71 +1524,53 @@
               <w:spacing w:before="0" w:after="40" w:line="252" w:lineRule="auto"/>
               <w:ind w:right="-32"/>
             </w:pPr>
-            <w:r/>
-            <w:r>
-              <w:rPr>
-                <w:rFonts w:ascii="Arial" w:hAnsi="Arial"/>
-                <w:b w:val="0"/>
-                <w:color w:val="000000"/>
-                <w:sz w:val="19"/>
-              </w:rPr>
-              <w:t>• Běžná cloudová infrastruktura (databáze, hosting)</w:t>
-            </w:r>
-          </w:p>
-          <w:p>
-            <w:pPr>
-              <w:spacing w:before="0" w:after="40" w:line="252" w:lineRule="auto"/>
-            </w:pPr>
-            <w:r>
-              <w:rPr>
-                <w:rFonts w:ascii="Arial" w:hAnsi="Arial"/>
-                <w:b w:val="0"/>
-                <w:color w:val="000000"/>
-                <w:sz w:val="19"/>
-              </w:rPr>
-              <w:t>• Vývoj a údržba webové aplikace</w:t>
-            </w:r>
-          </w:p>
-          <w:p>
-            <w:pPr>
-              <w:spacing w:before="0" w:after="40" w:line="252" w:lineRule="auto"/>
-            </w:pPr>
-            <w:r>
-              <w:rPr>
-                <w:rFonts w:ascii="Arial" w:hAnsi="Arial"/>
-                <w:b w:val="0"/>
-                <w:color w:val="000000"/>
-                <w:sz w:val="19"/>
-              </w:rPr>
-              <w:t xml:space="preserve">• Práce vývojového týmu (hodinová sazba × hodiny, výpočet po konzultaci s Honzou)</w:t>
-            </w:r>
-          </w:p>
-          <w:p>
-            <w:pPr>
-              <w:spacing w:before="0" w:after="40" w:line="252" w:lineRule="auto"/>
-            </w:pPr>
-            <w:r>
-              <w:rPr>
-                <w:rFonts w:ascii="Arial" w:hAnsi="Arial"/>
-                <w:b w:val="0"/>
-                <w:color w:val="000000"/>
-                <w:sz w:val="19"/>
-              </w:rPr>
-              <w:t>• Doména a DNS</w:t>
-            </w:r>
-          </w:p>
-          <w:p>
-            <w:pPr>
-              <w:spacing w:before="0" w:after="40" w:line="252" w:lineRule="auto"/>
-            </w:pPr>
-            <w:r>
-              <w:rPr>
-                <w:rFonts w:ascii="Arial" w:hAnsi="Arial"/>
-                <w:b w:val="0"/>
-                <w:color w:val="000000"/>
-                <w:sz w:val="19"/>
-              </w:rPr>
-              <w:t xml:space="preserve">• Cíl: návratnost do cca 6 měsíců</w:t>
+            <w:r>
+              <w:t xml:space="preserve">• Vývoj MVP: 320 h × 600 Kč = 192 000 Kč jednorázově (4 lidé, sprinty 2–6)</w:t>
+            </w:r>
+          </w:p>
+          <w:p>
+            <w:pPr>
+              <w:spacing w:before="0" w:after="40" w:line="252" w:lineRule="auto"/>
+              <w:ind w:right="-32"/>
+            </w:pPr>
+            <w:r>
+              <w:t xml:space="preserve">• Údržba a podpora: 16 h × 600 Kč = 9 600 Kč měsíčně</w:t>
+            </w:r>
+          </w:p>
+          <w:p>
+            <w:pPr>
+              <w:spacing w:before="0" w:after="40" w:line="252" w:lineRule="auto"/>
+              <w:ind w:right="-32"/>
+            </w:pPr>
+            <w:r>
+              <w:t xml:space="preserve">• Infrastruktura: 600 Kč měsíčně, od 8. měsíce 2 050 Kč (hosting, databáze, e-maily)</w:t>
+            </w:r>
+          </w:p>
+          <w:p>
+            <w:pPr>
+              <w:spacing w:before="0" w:after="40" w:line="252" w:lineRule="auto"/>
+              <w:ind w:right="-32"/>
+            </w:pPr>
+            <w:r>
+              <w:t xml:space="preserve">• Získání trenéra: 1 500 Kč (osobní schůzka a onboarding)</w:t>
+            </w:r>
+          </w:p>
+          <w:p>
+            <w:pPr>
+              <w:spacing w:before="0" w:after="40" w:line="252" w:lineRule="auto"/>
+              <w:ind w:right="-32"/>
+            </w:pPr>
+            <w:r>
+              <w:t xml:space="preserve">• Platební brána 2 % z příjmů, doména 400 Kč ročně</w:t>
+            </w:r>
+          </w:p>
+          <w:p>
+            <w:pPr>
+              <w:spacing w:before="0" w:after="40" w:line="252" w:lineRule="auto"/>
+              <w:ind w:right="-32"/>
+            </w:pPr>
+            <w:r>
+              <w:t xml:space="preserve">• Bod zvratu: měsíční v 15. měsíci, návratnost vývoje ve 34. měsíci</w:t>
             </w:r>
           </w:p>
         </w:tc>

</xml_diff>